<commit_message>
Update Bible translation content and resources for multiple languages for 2026-05-21 release
</commit_message>
<xml_diff>
--- a/ind/docx/40.content.docx
+++ b/ind/docx/40.content.docx
@@ -10404,6 +10404,1786 @@
         <w:rPr>
           <w:lang w:val="id_ID" w:bidi="id_ID"/>
         </w:rPr>
+        <w:t>Matius 1:19 (#2)</w:t>
+      </w:r>
+      <w:r>
+        <w:rPr>
+          <w:lang w:val="id_ID" w:bidi="id_ID"/>
+        </w:rPr>
+      </w:r>
+    </w:p>
+    <w:p>
+      <w:pPr/>
+      <w:r>
+        <w:rPr>
+          <w:lang w:val="id_ID" w:bidi="id_ID"/>
+        </w:rPr>
+      </w:r>
+      <w:r>
+        <w:rPr>
+          <w:b/>
+          <w:lang w:val="id_ID" w:bidi="id_ID"/>
+        </w:rPr>
+        <w:t>"Yusuf suaminya"</w:t>
+      </w:r>
+    </w:p>
+    <w:p>
+      <w:pPr/>
+      <w:r>
+        <w:rPr>
+          <w:lang w:val="id_ID" w:bidi="id_ID"/>
+        </w:rPr>
+      </w:r>
+      <w:r>
+        <w:rPr>
+          <w:lang w:val="id_ID" w:bidi="id_ID"/>
+        </w:rPr>
+        <w:t xml:space="preserve">Kitab Matius menyiratkan bahwa Yusuf tidak tahu bahwa bayi itu berasal dari Roh Kudus. Yusuf menyangka bahwa Maria hamil karena berhubungan intim dengan laki-laki lain, itulah sebabnya dia ingin </w:t>
+      </w:r>
+      <w:r>
+        <w:rPr>
+          <w:b/>
+          <w:lang w:val="id_ID" w:bidi="id_ID"/>
+        </w:rPr>
+        <w:t>menceraikannya</w:t>
+      </w:r>
+      <w:r>
+        <w:rPr>
+          <w:lang w:val="id_ID" w:bidi="id_ID"/>
+        </w:rPr>
+        <w:t>. Jika berguna dalam bahasa Anda, Anda dapat menjelaskan bahwa Yusuf tidak tahu bahwa Roh Kuduslah yang membuat Maria hamil. Terjemahan alternatif: "Yusuf suaminya berpikir bahwa Maria tidak setia, sehingga"</w:t>
+      </w:r>
+    </w:p>
+    <w:p>
+      <w:pPr/>
+      <w:r>
+        <w:rPr>
+          <w:lang w:val="id_ID" w:bidi="id_ID"/>
+        </w:rPr>
+      </w:r>
+      <w:r>
+        <w:rPr>
+          <w:lang w:val="id_ID" w:bidi="id_ID"/>
+        </w:rPr>
+        <w:t xml:space="preserve">Lihat: </w:t>
+      </w:r>
+      <w:r>
+        <w:rPr>
+          <w:lang w:val="id_ID" w:bidi="id_ID"/>
+        </w:rPr>
+        <w:t>Hal-Hal yang Dianggap Sudah Diketahui dan Informasi yang Tersirat</w:t>
+      </w:r>
+      <w:r>
+        <w:rPr>
+          <w:lang w:val="id_ID" w:bidi="id_ID"/>
+        </w:rPr>
+      </w:r>
+      <w:r>
+        <w:rPr>
+          <w:lang w:val="id_ID" w:bidi="id_ID"/>
+        </w:rPr>
+      </w:r>
+    </w:p>
+    <w:p>
+      <w:pPr/>
+      <w:r>
+        <w:rPr>
+          <w:lang w:val="id_ID" w:bidi="id_ID"/>
+        </w:rPr>
+      </w:r>
+    </w:p>
+    <w:p>
+      <w:pPr>
+        <w:pStyle w:val="Heading2"/>
+      </w:pPr>
+      <w:r>
+        <w:rPr>
+          <w:lang w:val="id_ID" w:bidi="id_ID"/>
+        </w:rPr>
+        <w:t>Matius 1:19 (#3)</w:t>
+      </w:r>
+      <w:r>
+        <w:rPr>
+          <w:lang w:val="id_ID" w:bidi="id_ID"/>
+        </w:rPr>
+      </w:r>
+    </w:p>
+    <w:p>
+      <w:pPr/>
+      <w:r>
+        <w:rPr>
+          <w:lang w:val="id_ID" w:bidi="id_ID"/>
+        </w:rPr>
+      </w:r>
+      <w:r>
+        <w:rPr>
+          <w:b/>
+          <w:lang w:val="id_ID" w:bidi="id_ID"/>
+        </w:rPr>
+        <w:t>"suaminya,"</w:t>
+      </w:r>
+      <w:r>
+        <w:rPr>
+          <w:lang w:val="id_ID" w:bidi="id_ID"/>
+        </w:rPr>
+        <w:t xml:space="preserve"> - </w:t>
+      </w:r>
+      <w:r>
+        <w:rPr>
+          <w:b/>
+          <w:lang w:val="id_ID" w:bidi="id_ID"/>
+        </w:rPr>
+        <w:t>"bermaksud menceraikannya"</w:t>
+      </w:r>
+    </w:p>
+    <w:p>
+      <w:pPr/>
+      <w:r>
+        <w:rPr>
+          <w:lang w:val="id_ID" w:bidi="id_ID"/>
+        </w:rPr>
+      </w:r>
+      <w:r>
+        <w:rPr>
+          <w:lang w:val="id_ID" w:bidi="id_ID"/>
+        </w:rPr>
+        <w:t xml:space="preserve">Seperti yang ditunjukkan pada ayat sebelumnya (lihat </w:t>
+      </w:r>
+      <w:hyperlink r:id="rId26">
+        <w:r>
+          <w:rPr>
+            <w:lang w:val="id_ID" w:bidi="id_ID"/>
+          </w:rPr>
+          <w:rPr>
+            <w:color w:val="0000EE"/>
+            <w:u w:val="single"/>
+          </w:rPr>
+          <w:t>Mat. 1:18</w:t>
+        </w:r>
+      </w:hyperlink>
+      <w:r>
+        <w:rPr>
+          <w:lang w:val="id_ID" w:bidi="id_ID"/>
+        </w:rPr>
+        <w:t xml:space="preserve">), Maria dan Yusuf belum menikah. Namun, dalam budaya mereka, "bertunangan" merupakan sebuah janji untuk menikah, sehingga kitab Matius dapat menyebut </w:t>
+      </w:r>
+      <w:r>
+        <w:rPr>
+          <w:b/>
+          <w:lang w:val="id_ID" w:bidi="id_ID"/>
+        </w:rPr>
+        <w:t>Yusuf</w:t>
+      </w:r>
+      <w:r>
+        <w:rPr>
+          <w:lang w:val="id_ID" w:bidi="id_ID"/>
+        </w:rPr>
+        <w:t xml:space="preserve"> sebagai </w:t>
+      </w:r>
+      <w:r>
+        <w:rPr>
+          <w:b/>
+          <w:lang w:val="id_ID" w:bidi="id_ID"/>
+        </w:rPr>
+        <w:t>suami</w:t>
+      </w:r>
+      <w:r>
+        <w:rPr>
+          <w:lang w:val="id_ID" w:bidi="id_ID"/>
+        </w:rPr>
+        <w:t xml:space="preserve"> Maria. Dia juga dapat menyebut pembatalan pertunangan sebagai perceraian. Jika berguna dalam bahasa Anda, Anda dapat menjelaskan bahwa kitab Matius merujuk pada seorang laki-laki yang bertunangan kemudian membatalkan pertunangan tersebut. Terjemahan alternatif: “tunangannya … membatalkan pertunangan dengannya”</w:t>
+      </w:r>
+    </w:p>
+    <w:p>
+      <w:pPr/>
+      <w:r>
+        <w:rPr>
+          <w:lang w:val="id_ID" w:bidi="id_ID"/>
+        </w:rPr>
+      </w:r>
+      <w:r>
+        <w:rPr>
+          <w:lang w:val="id_ID" w:bidi="id_ID"/>
+        </w:rPr>
+        <w:t xml:space="preserve">Lihat: </w:t>
+      </w:r>
+      <w:r>
+        <w:rPr>
+          <w:lang w:val="id_ID" w:bidi="id_ID"/>
+        </w:rPr>
+        <w:t>Hal-Hal yang Dianggap Sudah Diketahui dan Informasi yang Tersirat</w:t>
+      </w:r>
+      <w:r>
+        <w:rPr>
+          <w:lang w:val="id_ID" w:bidi="id_ID"/>
+        </w:rPr>
+      </w:r>
+      <w:r>
+        <w:rPr>
+          <w:lang w:val="id_ID" w:bidi="id_ID"/>
+        </w:rPr>
+      </w:r>
+    </w:p>
+    <w:p>
+      <w:pPr/>
+      <w:r>
+        <w:rPr>
+          <w:lang w:val="id_ID" w:bidi="id_ID"/>
+        </w:rPr>
+      </w:r>
+    </w:p>
+    <w:p>
+      <w:pPr>
+        <w:pStyle w:val="Heading2"/>
+      </w:pPr>
+      <w:r>
+        <w:rPr>
+          <w:lang w:val="id_ID" w:bidi="id_ID"/>
+        </w:rPr>
+        <w:t>Matius 1:20 (#1)</w:t>
+      </w:r>
+      <w:r>
+        <w:rPr>
+          <w:lang w:val="id_ID" w:bidi="id_ID"/>
+        </w:rPr>
+      </w:r>
+    </w:p>
+    <w:p>
+      <w:pPr/>
+      <w:r>
+        <w:rPr>
+          <w:lang w:val="id_ID" w:bidi="id_ID"/>
+        </w:rPr>
+      </w:r>
+      <w:r>
+        <w:rPr>
+          <w:b/>
+          <w:lang w:val="id_ID" w:bidi="id_ID"/>
+        </w:rPr>
+        <w:t>"</w:t>
+      </w:r>
+      <w:r>
+        <w:rPr>
+          <w:b/>
+          <w:lang w:val="id_ID" w:bidi="id_ID"/>
+        </w:rPr>
+        <w:t>ketika ia mempertimbangkan maksud itu, malaikat Tuhan nampak kepadanya</w:t>
+      </w:r>
+      <w:r>
+        <w:rPr>
+          <w:b/>
+          <w:lang w:val="id_ID" w:bidi="id_ID"/>
+        </w:rPr>
+        <w:t>"</w:t>
+      </w:r>
+    </w:p>
+    <w:p>
+      <w:pPr/>
+      <w:r>
+        <w:rPr>
+          <w:lang w:val="id_ID" w:bidi="id_ID"/>
+        </w:rPr>
+      </w:r>
+      <w:r>
+        <w:rPr>
+          <w:lang w:val="id_ID" w:bidi="id_ID"/>
+        </w:rPr>
+        <w:t>Malaikat menampakkan diri kepada Yusuf ketika dia memutuskan untuk menceraikan Maria. Jika berguna dalam bahasa Anda, Anda dapat membuat hubungan ini lebih jelas. Terjemahan alternatif: "pada waktu Yusuf merenungkan hal-hal ini, tiba-tiba malaikat Tuhan muncul"</w:t>
+      </w:r>
+    </w:p>
+    <w:p>
+      <w:pPr/>
+      <w:r>
+        <w:rPr>
+          <w:lang w:val="id_ID" w:bidi="id_ID"/>
+        </w:rPr>
+      </w:r>
+      <w:r>
+        <w:rPr>
+          <w:lang w:val="id_ID" w:bidi="id_ID"/>
+        </w:rPr>
+        <w:t xml:space="preserve">Lihat: </w:t>
+      </w:r>
+      <w:r>
+        <w:rPr>
+          <w:lang w:val="id_ID" w:bidi="id_ID"/>
+        </w:rPr>
+        <w:t>Menghubungkan — Hubungan Waktu yang Bersamaan</w:t>
+      </w:r>
+      <w:r>
+        <w:rPr>
+          <w:lang w:val="id_ID" w:bidi="id_ID"/>
+        </w:rPr>
+      </w:r>
+      <w:r>
+        <w:rPr>
+          <w:lang w:val="id_ID" w:bidi="id_ID"/>
+        </w:rPr>
+      </w:r>
+    </w:p>
+    <w:p>
+      <w:pPr/>
+      <w:r>
+        <w:rPr>
+          <w:lang w:val="id_ID" w:bidi="id_ID"/>
+        </w:rPr>
+      </w:r>
+    </w:p>
+    <w:p>
+      <w:pPr>
+        <w:pStyle w:val="Heading2"/>
+      </w:pPr>
+      <w:r>
+        <w:rPr>
+          <w:lang w:val="id_ID" w:bidi="id_ID"/>
+        </w:rPr>
+        <w:t>Matius 1:20 (#2)</w:t>
+      </w:r>
+      <w:r>
+        <w:rPr>
+          <w:lang w:val="id_ID" w:bidi="id_ID"/>
+        </w:rPr>
+      </w:r>
+    </w:p>
+    <w:p>
+      <w:pPr/>
+      <w:r>
+        <w:rPr>
+          <w:lang w:val="id_ID" w:bidi="id_ID"/>
+        </w:rPr>
+      </w:r>
+      <w:r>
+        <w:rPr>
+          <w:b/>
+          <w:lang w:val="id_ID" w:bidi="id_ID"/>
+        </w:rPr>
+        <w:t>"behold"</w:t>
+      </w:r>
+    </w:p>
+    <w:p>
+      <w:pPr/>
+      <w:r>
+        <w:rPr>
+          <w:lang w:val="id_ID" w:bidi="id_ID"/>
+        </w:rPr>
+      </w:r>
+      <w:r>
+        <w:rPr>
+          <w:lang w:val="id_ID" w:bidi="id_ID"/>
+        </w:rPr>
+        <w:t>Ada versi bahasa Inggris yang menggunakan kata "</w:t>
+      </w:r>
+      <w:r>
+        <w:rPr>
+          <w:i/>
+          <w:lang w:val="id_ID" w:bidi="id_ID"/>
+        </w:rPr>
+        <w:t>behold</w:t>
+      </w:r>
+      <w:r>
+        <w:rPr>
+          <w:lang w:val="id_ID" w:bidi="id_ID"/>
+        </w:rPr>
+        <w:t>" sebelum kalimat "</w:t>
+      </w:r>
+      <w:r>
+        <w:rPr>
+          <w:lang w:val="id_ID" w:bidi="id_ID"/>
+        </w:rPr>
+        <w:t xml:space="preserve">malaikat Tuhan nampak kepadanya." </w:t>
+      </w:r>
+      <w:r>
+        <w:rPr>
+          <w:lang w:val="id_ID" w:bidi="id_ID"/>
+        </w:rPr>
+        <w:t xml:space="preserve">Di sini, kata </w:t>
+      </w:r>
+      <w:r>
+        <w:rPr>
+          <w:b/>
+          <w:i/>
+          <w:lang w:val="id_ID" w:bidi="id_ID"/>
+        </w:rPr>
+        <w:t>behold</w:t>
+      </w:r>
+      <w:r>
+        <w:rPr>
+          <w:b/>
+          <w:lang w:val="id_ID" w:bidi="id_ID"/>
+        </w:rPr>
+        <w:t xml:space="preserve"> </w:t>
+      </w:r>
+      <w:r>
+        <w:rPr>
+          <w:lang w:val="id_ID" w:bidi="id_ID"/>
+        </w:rPr>
+        <w:t xml:space="preserve">berfungsi untuk menarik perhatian pendengar dan meminta mereka untuk menyimak dengan seksama. Jika berguna dalam bahasa Anda, Anda dapat mengungkapkan kata </w:t>
+      </w:r>
+      <w:r>
+        <w:rPr>
+          <w:i/>
+          <w:lang w:val="id_ID" w:bidi="id_ID"/>
+        </w:rPr>
+        <w:t>behold</w:t>
+      </w:r>
+      <w:r>
+        <w:rPr>
+          <w:lang w:val="id_ID" w:bidi="id_ID"/>
+        </w:rPr>
+        <w:t xml:space="preserve"> dengan kata atau frasa yang meminta para pendengar untuk menyimak, atau Anda dapat menarik perhatian pendengar dengan cara yang lain. Terjemahan alternatif: “perhatikanlah” atau “tiba-tiba”</w:t>
+      </w:r>
+    </w:p>
+    <w:p>
+      <w:pPr/>
+      <w:r>
+        <w:rPr>
+          <w:lang w:val="id_ID" w:bidi="id_ID"/>
+        </w:rPr>
+      </w:r>
+      <w:r>
+        <w:rPr>
+          <w:lang w:val="id_ID" w:bidi="id_ID"/>
+        </w:rPr>
+        <w:t xml:space="preserve">Lihat: </w:t>
+      </w:r>
+      <w:r>
+        <w:rPr>
+          <w:lang w:val="id_ID" w:bidi="id_ID"/>
+        </w:rPr>
+        <w:t>Kata Seru</w:t>
+      </w:r>
+      <w:r>
+        <w:rPr>
+          <w:lang w:val="id_ID" w:bidi="id_ID"/>
+        </w:rPr>
+      </w:r>
+      <w:r>
+        <w:rPr>
+          <w:lang w:val="id_ID" w:bidi="id_ID"/>
+        </w:rPr>
+      </w:r>
+    </w:p>
+    <w:p>
+      <w:pPr/>
+      <w:r>
+        <w:rPr>
+          <w:lang w:val="id_ID" w:bidi="id_ID"/>
+        </w:rPr>
+      </w:r>
+    </w:p>
+    <w:p>
+      <w:pPr>
+        <w:pStyle w:val="Heading2"/>
+      </w:pPr>
+      <w:r>
+        <w:rPr>
+          <w:lang w:val="id_ID" w:bidi="id_ID"/>
+        </w:rPr>
+        <w:t>Matius 1:20 (#3)</w:t>
+      </w:r>
+      <w:r>
+        <w:rPr>
+          <w:lang w:val="id_ID" w:bidi="id_ID"/>
+        </w:rPr>
+      </w:r>
+    </w:p>
+    <w:p>
+      <w:pPr/>
+      <w:r>
+        <w:rPr>
+          <w:lang w:val="id_ID" w:bidi="id_ID"/>
+        </w:rPr>
+      </w:r>
+      <w:r>
+        <w:rPr>
+          <w:b/>
+          <w:lang w:val="id_ID" w:bidi="id_ID"/>
+        </w:rPr>
+        <w:t>"dan berkata"</w:t>
+      </w:r>
+    </w:p>
+    <w:p>
+      <w:pPr/>
+      <w:r>
+        <w:rPr>
+          <w:lang w:val="id_ID" w:bidi="id_ID"/>
+        </w:rPr>
+      </w:r>
+      <w:r>
+        <w:rPr>
+          <w:lang w:val="id_ID" w:bidi="id_ID"/>
+        </w:rPr>
+        <w:t>Pertimbangkan cara yang lazim untuk mengawali kutipan langsung dalam bahasa Anda. Terjemahan alternatif: "dan dia menyatakan"</w:t>
+      </w:r>
+    </w:p>
+    <w:p>
+      <w:pPr/>
+      <w:r>
+        <w:rPr>
+          <w:lang w:val="id_ID" w:bidi="id_ID"/>
+        </w:rPr>
+      </w:r>
+      <w:r>
+        <w:rPr>
+          <w:lang w:val="id_ID" w:bidi="id_ID"/>
+        </w:rPr>
+        <w:t xml:space="preserve">Lihat: </w:t>
+      </w:r>
+      <w:r>
+        <w:rPr>
+          <w:lang w:val="id_ID" w:bidi="id_ID"/>
+        </w:rPr>
+        <w:t>Kutipan dan Penanda Kutipan</w:t>
+      </w:r>
+      <w:r>
+        <w:rPr>
+          <w:lang w:val="id_ID" w:bidi="id_ID"/>
+        </w:rPr>
+      </w:r>
+      <w:r>
+        <w:rPr>
+          <w:lang w:val="id_ID" w:bidi="id_ID"/>
+        </w:rPr>
+      </w:r>
+    </w:p>
+    <w:p>
+      <w:pPr/>
+      <w:r>
+        <w:rPr>
+          <w:lang w:val="id_ID" w:bidi="id_ID"/>
+        </w:rPr>
+      </w:r>
+    </w:p>
+    <w:p>
+      <w:pPr>
+        <w:pStyle w:val="Heading2"/>
+      </w:pPr>
+      <w:r>
+        <w:rPr>
+          <w:lang w:val="id_ID" w:bidi="id_ID"/>
+        </w:rPr>
+        <w:t>Matius 1:20 (#4)</w:t>
+      </w:r>
+      <w:r>
+        <w:rPr>
+          <w:lang w:val="id_ID" w:bidi="id_ID"/>
+        </w:rPr>
+      </w:r>
+    </w:p>
+    <w:p>
+      <w:pPr/>
+      <w:r>
+        <w:rPr>
+          <w:lang w:val="id_ID" w:bidi="id_ID"/>
+        </w:rPr>
+      </w:r>
+      <w:r>
+        <w:rPr>
+          <w:b/>
+          <w:lang w:val="id_ID" w:bidi="id_ID"/>
+        </w:rPr>
+        <w:t>"anak Daud"</w:t>
+      </w:r>
+    </w:p>
+    <w:p>
+      <w:pPr/>
+      <w:r>
+        <w:rPr>
+          <w:lang w:val="id_ID" w:bidi="id_ID"/>
+        </w:rPr>
+      </w:r>
+      <w:r>
+        <w:rPr>
+          <w:lang w:val="id_ID" w:bidi="id_ID"/>
+        </w:rPr>
+        <w:t xml:space="preserve">Di sini, kitab Matius berbicara tentang keturunan laki-laki seperti seorang </w:t>
+      </w:r>
+      <w:r>
+        <w:rPr>
+          <w:b/>
+          <w:lang w:val="id_ID" w:bidi="id_ID"/>
+        </w:rPr>
+        <w:t>anak langsung</w:t>
+      </w:r>
+      <w:r>
+        <w:rPr>
+          <w:lang w:val="id_ID" w:bidi="id_ID"/>
+        </w:rPr>
+        <w:t>. Jika berguna dalam bahasa Anda, Anda dapat menyatakan maknanya dengan jelas. Terjemahan alternatif: “yang adalah keturunan Daud”</w:t>
+      </w:r>
+    </w:p>
+    <w:p>
+      <w:pPr/>
+      <w:r>
+        <w:rPr>
+          <w:lang w:val="id_ID" w:bidi="id_ID"/>
+        </w:rPr>
+      </w:r>
+      <w:r>
+        <w:rPr>
+          <w:lang w:val="id_ID" w:bidi="id_ID"/>
+        </w:rPr>
+        <w:t xml:space="preserve">Lihat: </w:t>
+      </w:r>
+      <w:r>
+        <w:rPr>
+          <w:lang w:val="id_ID" w:bidi="id_ID"/>
+        </w:rPr>
+        <w:t>Metafora</w:t>
+      </w:r>
+      <w:r>
+        <w:rPr>
+          <w:lang w:val="id_ID" w:bidi="id_ID"/>
+        </w:rPr>
+      </w:r>
+      <w:r>
+        <w:rPr>
+          <w:lang w:val="id_ID" w:bidi="id_ID"/>
+        </w:rPr>
+      </w:r>
+    </w:p>
+    <w:p>
+      <w:pPr/>
+      <w:r>
+        <w:rPr>
+          <w:lang w:val="id_ID" w:bidi="id_ID"/>
+        </w:rPr>
+      </w:r>
+    </w:p>
+    <w:p>
+      <w:pPr>
+        <w:pStyle w:val="Heading2"/>
+      </w:pPr>
+      <w:r>
+        <w:rPr>
+          <w:lang w:val="id_ID" w:bidi="id_ID"/>
+        </w:rPr>
+        <w:t>Matius 1:20 (#5)</w:t>
+      </w:r>
+      <w:r>
+        <w:rPr>
+          <w:lang w:val="id_ID" w:bidi="id_ID"/>
+        </w:rPr>
+      </w:r>
+    </w:p>
+    <w:p>
+      <w:pPr/>
+      <w:r>
+        <w:rPr>
+          <w:lang w:val="id_ID" w:bidi="id_ID"/>
+        </w:rPr>
+      </w:r>
+      <w:r>
+        <w:rPr>
+          <w:b/>
+          <w:lang w:val="id_ID" w:bidi="id_ID"/>
+        </w:rPr>
+        <w:t>"</w:t>
+      </w:r>
+      <w:r>
+        <w:rPr>
+          <w:b/>
+          <w:lang w:val="id_ID" w:bidi="id_ID"/>
+        </w:rPr>
+        <w:t>janganlah engkau takut mengambil Maria sebagai isterimu, sebab anak yang di dalam kandungannya adalah dari Roh Kudus</w:t>
+      </w:r>
+      <w:r>
+        <w:rPr>
+          <w:b/>
+          <w:lang w:val="id_ID" w:bidi="id_ID"/>
+        </w:rPr>
+        <w:t>"</w:t>
+      </w:r>
+    </w:p>
+    <w:p>
+      <w:pPr/>
+      <w:r>
+        <w:rPr>
+          <w:lang w:val="id_ID" w:bidi="id_ID"/>
+        </w:rPr>
+      </w:r>
+      <w:r>
+        <w:rPr>
+          <w:lang w:val="id_ID" w:bidi="id_ID"/>
+        </w:rPr>
+        <w:t>Jika lebih wajar dalam bahasa Anda, Anda dapat mengubah urutan klausa ini, karena klausa kedua memberikan alasan untuk perintah pada klausa yang pertama. Terjemahan alternatif: "anak yang dikandung oleh Maria berasal dari Roh Kudus, jadi engkau tidak perlu takut untuk mengambilnya sebagai istrimu"</w:t>
+      </w:r>
+    </w:p>
+    <w:p>
+      <w:pPr/>
+      <w:r>
+        <w:rPr>
+          <w:lang w:val="id_ID" w:bidi="id_ID"/>
+        </w:rPr>
+      </w:r>
+      <w:r>
+        <w:rPr>
+          <w:lang w:val="id_ID" w:bidi="id_ID"/>
+        </w:rPr>
+        <w:t xml:space="preserve">Lihat: </w:t>
+      </w:r>
+      <w:r>
+        <w:rPr>
+          <w:lang w:val="id_ID" w:bidi="id_ID"/>
+        </w:rPr>
+        <w:t>Menghubungkan — Hubungan Sebab dan Akibat</w:t>
+      </w:r>
+      <w:r>
+        <w:rPr>
+          <w:lang w:val="id_ID" w:bidi="id_ID"/>
+        </w:rPr>
+      </w:r>
+      <w:r>
+        <w:rPr>
+          <w:lang w:val="id_ID" w:bidi="id_ID"/>
+        </w:rPr>
+      </w:r>
+    </w:p>
+    <w:p>
+      <w:pPr/>
+      <w:r>
+        <w:rPr>
+          <w:lang w:val="id_ID" w:bidi="id_ID"/>
+        </w:rPr>
+      </w:r>
+    </w:p>
+    <w:p>
+      <w:pPr>
+        <w:pStyle w:val="Heading2"/>
+      </w:pPr>
+      <w:r>
+        <w:rPr>
+          <w:lang w:val="id_ID" w:bidi="id_ID"/>
+        </w:rPr>
+        <w:t>Matius 1:20 (#6)</w:t>
+      </w:r>
+      <w:r>
+        <w:rPr>
+          <w:lang w:val="id_ID" w:bidi="id_ID"/>
+        </w:rPr>
+      </w:r>
+    </w:p>
+    <w:p>
+      <w:pPr/>
+      <w:r>
+        <w:rPr>
+          <w:lang w:val="id_ID" w:bidi="id_ID"/>
+        </w:rPr>
+      </w:r>
+      <w:r>
+        <w:rPr>
+          <w:b/>
+          <w:lang w:val="id_ID" w:bidi="id_ID"/>
+        </w:rPr>
+        <w:t>"yang di dalam kandungannya adalah dari Roh Kudus"</w:t>
+      </w:r>
+    </w:p>
+    <w:p>
+      <w:pPr/>
+      <w:r>
+        <w:rPr>
+          <w:lang w:val="id_ID" w:bidi="id_ID"/>
+        </w:rPr>
+      </w:r>
+      <w:r>
+        <w:rPr>
+          <w:lang w:val="id_ID" w:bidi="id_ID"/>
+        </w:rPr>
+        <w:t>Jika bahasa Anda tidak menggunakan bentuk pasif ini, Anda dapat mengungkapkan gagasan tersebut dalam bentuk aktif atau dengan cara lain yang alami dalam bahasa Anda. Terjemahan alternatif: "Roh Kuduslah yang telah membuat dia mengandung anak itu"</w:t>
+      </w:r>
+    </w:p>
+    <w:p>
+      <w:pPr/>
+      <w:r>
+        <w:rPr>
+          <w:lang w:val="id_ID" w:bidi="id_ID"/>
+        </w:rPr>
+      </w:r>
+      <w:r>
+        <w:rPr>
+          <w:lang w:val="id_ID" w:bidi="id_ID"/>
+        </w:rPr>
+        <w:t xml:space="preserve">Lihat: </w:t>
+      </w:r>
+      <w:r>
+        <w:rPr>
+          <w:lang w:val="id_ID" w:bidi="id_ID"/>
+        </w:rPr>
+        <w:t>Aktif atau Pasif</w:t>
+      </w:r>
+      <w:r>
+        <w:rPr>
+          <w:lang w:val="id_ID" w:bidi="id_ID"/>
+        </w:rPr>
+      </w:r>
+      <w:r>
+        <w:rPr>
+          <w:lang w:val="id_ID" w:bidi="id_ID"/>
+        </w:rPr>
+      </w:r>
+    </w:p>
+    <w:p>
+      <w:pPr/>
+      <w:r>
+        <w:rPr>
+          <w:lang w:val="id_ID" w:bidi="id_ID"/>
+        </w:rPr>
+      </w:r>
+    </w:p>
+    <w:p>
+      <w:pPr>
+        <w:pStyle w:val="Heading2"/>
+      </w:pPr>
+      <w:r>
+        <w:rPr>
+          <w:lang w:val="id_ID" w:bidi="id_ID"/>
+        </w:rPr>
+        <w:t>Matius 1:21 (#1)</w:t>
+      </w:r>
+      <w:r>
+        <w:rPr>
+          <w:lang w:val="id_ID" w:bidi="id_ID"/>
+        </w:rPr>
+      </w:r>
+    </w:p>
+    <w:p>
+      <w:pPr/>
+      <w:r>
+        <w:rPr>
+          <w:lang w:val="id_ID" w:bidi="id_ID"/>
+        </w:rPr>
+      </w:r>
+      <w:r>
+        <w:rPr>
+          <w:b/>
+          <w:lang w:val="id_ID" w:bidi="id_ID"/>
+        </w:rPr>
+        <w:t>"</w:t>
+      </w:r>
+      <w:r>
+        <w:rPr>
+          <w:b/>
+          <w:lang w:val="id_ID" w:bidi="id_ID"/>
+        </w:rPr>
+        <w:t>dan engkau akan menamakan Dia Yesus, karena Dialah yang akan menyelamatkan umat-Nya dari dosa mereka</w:t>
+      </w:r>
+      <w:r>
+        <w:rPr>
+          <w:b/>
+          <w:lang w:val="id_ID" w:bidi="id_ID"/>
+        </w:rPr>
+        <w:t>"</w:t>
+      </w:r>
+    </w:p>
+    <w:p>
+      <w:pPr/>
+      <w:r>
+        <w:rPr>
+          <w:lang w:val="id_ID" w:bidi="id_ID"/>
+        </w:rPr>
+      </w:r>
+      <w:r>
+        <w:rPr>
+          <w:lang w:val="id_ID" w:bidi="id_ID"/>
+        </w:rPr>
+        <w:t>Jika lebih wajar dalam bahasa Anda, Anda dapat mengubah urutan klausa ini, karena klausa kedua memberikan alasan untuk perintah yang dijelaskan pada klausa yang pertama. Terjemahan alternatif: "dan karena Dialah yang akan menyelamatkan umat-Nya dari dosa-dosa mereka, maka engkau harus menamai-Nya Yesus"</w:t>
+      </w:r>
+    </w:p>
+    <w:p>
+      <w:pPr/>
+      <w:r>
+        <w:rPr>
+          <w:lang w:val="id_ID" w:bidi="id_ID"/>
+        </w:rPr>
+      </w:r>
+      <w:r>
+        <w:rPr>
+          <w:lang w:val="id_ID" w:bidi="id_ID"/>
+        </w:rPr>
+        <w:t xml:space="preserve">Lihat: </w:t>
+      </w:r>
+      <w:r>
+        <w:rPr>
+          <w:lang w:val="id_ID" w:bidi="id_ID"/>
+        </w:rPr>
+        <w:t>Menghubungkan — Hubungan Sebab dan Akibat</w:t>
+      </w:r>
+      <w:r>
+        <w:rPr>
+          <w:lang w:val="id_ID" w:bidi="id_ID"/>
+        </w:rPr>
+      </w:r>
+      <w:r>
+        <w:rPr>
+          <w:lang w:val="id_ID" w:bidi="id_ID"/>
+        </w:rPr>
+      </w:r>
+    </w:p>
+    <w:p>
+      <w:pPr/>
+      <w:r>
+        <w:rPr>
+          <w:lang w:val="id_ID" w:bidi="id_ID"/>
+        </w:rPr>
+      </w:r>
+    </w:p>
+    <w:p>
+      <w:pPr>
+        <w:pStyle w:val="Heading2"/>
+      </w:pPr>
+      <w:r>
+        <w:rPr>
+          <w:lang w:val="id_ID" w:bidi="id_ID"/>
+        </w:rPr>
+        <w:t>Matius 1:21 (#2)</w:t>
+      </w:r>
+      <w:r>
+        <w:rPr>
+          <w:lang w:val="id_ID" w:bidi="id_ID"/>
+        </w:rPr>
+      </w:r>
+    </w:p>
+    <w:p>
+      <w:pPr/>
+      <w:r>
+        <w:rPr>
+          <w:lang w:val="id_ID" w:bidi="id_ID"/>
+        </w:rPr>
+      </w:r>
+      <w:r>
+        <w:rPr>
+          <w:b/>
+          <w:lang w:val="id_ID" w:bidi="id_ID"/>
+        </w:rPr>
+        <w:t>"engkau akan menamakan"</w:t>
+      </w:r>
+    </w:p>
+    <w:p>
+      <w:pPr/>
+      <w:r>
+        <w:rPr>
+          <w:lang w:val="id_ID" w:bidi="id_ID"/>
+        </w:rPr>
+      </w:r>
+      <w:r>
+        <w:rPr>
+          <w:lang w:val="id_ID" w:bidi="id_ID"/>
+        </w:rPr>
+        <w:t>Di sini malaikat memberikan sebuah perintah dengan menggunakan bentuk waktu masa depan. Jika bahasa Anda tidak menggunakan bentuk waktu masa depan untuk kalimat perintah, Anda dapat menggunakan bentuk yang digunakan dalam bahasa Anda untuk menyatakan perintah. Terjemahan alternatif: "engkau harus menamakan" atau "haruslah engkau menamai"</w:t>
+      </w:r>
+    </w:p>
+    <w:p>
+      <w:pPr/>
+      <w:r>
+        <w:rPr>
+          <w:lang w:val="id_ID" w:bidi="id_ID"/>
+        </w:rPr>
+      </w:r>
+      <w:r>
+        <w:rPr>
+          <w:lang w:val="id_ID" w:bidi="id_ID"/>
+        </w:rPr>
+        <w:t xml:space="preserve">Lihat: </w:t>
+      </w:r>
+      <w:r>
+        <w:rPr>
+          <w:lang w:val="id_ID" w:bidi="id_ID"/>
+        </w:rPr>
+        <w:t>Penggunaan Kata Kerja Tak Beraturan</w:t>
+      </w:r>
+      <w:r>
+        <w:rPr>
+          <w:lang w:val="id_ID" w:bidi="id_ID"/>
+        </w:rPr>
+      </w:r>
+      <w:r>
+        <w:rPr>
+          <w:lang w:val="id_ID" w:bidi="id_ID"/>
+        </w:rPr>
+      </w:r>
+    </w:p>
+    <w:p>
+      <w:pPr/>
+      <w:r>
+        <w:rPr>
+          <w:lang w:val="id_ID" w:bidi="id_ID"/>
+        </w:rPr>
+      </w:r>
+    </w:p>
+    <w:p>
+      <w:pPr>
+        <w:pStyle w:val="Heading2"/>
+      </w:pPr>
+      <w:r>
+        <w:rPr>
+          <w:lang w:val="id_ID" w:bidi="id_ID"/>
+        </w:rPr>
+        <w:t>Matius 1:21 (#3)</w:t>
+      </w:r>
+      <w:r>
+        <w:rPr>
+          <w:lang w:val="id_ID" w:bidi="id_ID"/>
+        </w:rPr>
+      </w:r>
+    </w:p>
+    <w:p>
+      <w:pPr/>
+      <w:r>
+        <w:rPr>
+          <w:lang w:val="id_ID" w:bidi="id_ID"/>
+        </w:rPr>
+      </w:r>
+      <w:r>
+        <w:rPr>
+          <w:b/>
+          <w:lang w:val="id_ID" w:bidi="id_ID"/>
+        </w:rPr>
+        <w:t>"</w:t>
+      </w:r>
+      <w:r>
+        <w:rPr>
+          <w:b/>
+          <w:lang w:val="id_ID" w:bidi="id_ID"/>
+        </w:rPr>
+        <w:t>Yesus, karena Dialah yang akan menyelamatkan umat-Nya dari dosa mereka</w:t>
+      </w:r>
+      <w:r>
+        <w:rPr>
+          <w:b/>
+          <w:lang w:val="id_ID" w:bidi="id_ID"/>
+        </w:rPr>
+        <w:t>"</w:t>
+      </w:r>
+    </w:p>
+    <w:p>
+      <w:pPr/>
+      <w:r>
+        <w:rPr>
+          <w:lang w:val="id_ID" w:bidi="id_ID"/>
+        </w:rPr>
+      </w:r>
+      <w:r>
+        <w:rPr>
+          <w:lang w:val="id_ID" w:bidi="id_ID"/>
+        </w:rPr>
+        <w:t xml:space="preserve">Nama </w:t>
+      </w:r>
+      <w:r>
+        <w:rPr>
+          <w:b/>
+          <w:lang w:val="id_ID" w:bidi="id_ID"/>
+        </w:rPr>
+        <w:t>Yesus</w:t>
+      </w:r>
+      <w:r>
+        <w:rPr>
+          <w:lang w:val="id_ID" w:bidi="id_ID"/>
+        </w:rPr>
+        <w:t xml:space="preserve"> dalam bahasa Ibrani berarti "Tuhan menyelamatkan". Malaikat menjelaskan bahwa </w:t>
+      </w:r>
+      <w:r>
+        <w:rPr>
+          <w:b/>
+          <w:lang w:val="id_ID" w:bidi="id_ID"/>
+        </w:rPr>
+        <w:t>Yesus</w:t>
+      </w:r>
+      <w:r>
+        <w:rPr>
+          <w:lang w:val="id_ID" w:bidi="id_ID"/>
+        </w:rPr>
+        <w:t xml:space="preserve"> harus dinamai demikian karena </w:t>
+      </w:r>
+      <w:r>
+        <w:rPr>
+          <w:b/>
+          <w:lang w:val="id_ID" w:bidi="id_ID"/>
+        </w:rPr>
+        <w:t>Dialah yang akan menyelamatkan umat-Nya</w:t>
+      </w:r>
+      <w:r>
+        <w:rPr>
+          <w:lang w:val="id_ID" w:bidi="id_ID"/>
+        </w:rPr>
+        <w:t>. Jika berguna dalam bahasa Anda, Anda dapat menjelaskan apa arti nama Yesus atau menyertakan informasi ini dalam catatan kaki. Terjemahan alternatif: "Yesus, karena, seperti yang ditunjukkan oleh nama-Nya, Dia yang akan menyelamatkan umat-Nya dari dosa-dosa mereka" atau "Yesus, artinya 'Tuhan menyelamatkan,' karena Dialah yang akan menyelamatkan umat-Nya dari dosa-dosa mereka"</w:t>
+      </w:r>
+    </w:p>
+    <w:p>
+      <w:pPr/>
+      <w:r>
+        <w:rPr>
+          <w:lang w:val="id_ID" w:bidi="id_ID"/>
+        </w:rPr>
+      </w:r>
+      <w:r>
+        <w:rPr>
+          <w:lang w:val="id_ID" w:bidi="id_ID"/>
+        </w:rPr>
+        <w:t xml:space="preserve">Lihat: </w:t>
+      </w:r>
+      <w:r>
+        <w:rPr>
+          <w:lang w:val="id_ID" w:bidi="id_ID"/>
+        </w:rPr>
+        <w:t>Hal-Hal yang Dianggap Sudah Diketahui dan Informasi yang Tersirat</w:t>
+      </w:r>
+      <w:r>
+        <w:rPr>
+          <w:lang w:val="id_ID" w:bidi="id_ID"/>
+        </w:rPr>
+      </w:r>
+      <w:r>
+        <w:rPr>
+          <w:lang w:val="id_ID" w:bidi="id_ID"/>
+        </w:rPr>
+      </w:r>
+    </w:p>
+    <w:p>
+      <w:pPr/>
+      <w:r>
+        <w:rPr>
+          <w:lang w:val="id_ID" w:bidi="id_ID"/>
+        </w:rPr>
+      </w:r>
+    </w:p>
+    <w:p>
+      <w:pPr>
+        <w:pStyle w:val="Heading2"/>
+      </w:pPr>
+      <w:r>
+        <w:rPr>
+          <w:lang w:val="id_ID" w:bidi="id_ID"/>
+        </w:rPr>
+        <w:t>Matius 1:21 (#4)</w:t>
+      </w:r>
+      <w:r>
+        <w:rPr>
+          <w:lang w:val="id_ID" w:bidi="id_ID"/>
+        </w:rPr>
+      </w:r>
+    </w:p>
+    <w:p>
+      <w:pPr/>
+      <w:r>
+        <w:rPr>
+          <w:lang w:val="id_ID" w:bidi="id_ID"/>
+        </w:rPr>
+      </w:r>
+      <w:r>
+        <w:rPr>
+          <w:b/>
+          <w:lang w:val="id_ID" w:bidi="id_ID"/>
+        </w:rPr>
+        <w:t>"umat-Nya"</w:t>
+      </w:r>
+    </w:p>
+    <w:p>
+      <w:pPr/>
+      <w:r>
+        <w:rPr>
+          <w:lang w:val="id_ID" w:bidi="id_ID"/>
+        </w:rPr>
+      </w:r>
+      <w:r>
+        <w:rPr>
+          <w:lang w:val="id_ID" w:bidi="id_ID"/>
+        </w:rPr>
+        <w:t xml:space="preserve">Di sini, frasa </w:t>
+      </w:r>
+      <w:r>
+        <w:rPr>
+          <w:b/>
+          <w:lang w:val="id_ID" w:bidi="id_ID"/>
+        </w:rPr>
+        <w:t>umat-Nya</w:t>
+      </w:r>
+      <w:r>
+        <w:rPr>
+          <w:lang w:val="id_ID" w:bidi="id_ID"/>
+        </w:rPr>
+        <w:t xml:space="preserve"> merujuk langsung pada orang-orang Yahudi, tetapi juga mencakup setiap orang yang percaya pada </w:t>
+      </w:r>
+      <w:r>
+        <w:rPr>
+          <w:b/>
+          <w:lang w:val="id_ID" w:bidi="id_ID"/>
+        </w:rPr>
+        <w:t>Yesus</w:t>
+      </w:r>
+      <w:r>
+        <w:rPr>
+          <w:lang w:val="id_ID" w:bidi="id_ID"/>
+        </w:rPr>
+        <w:t>. Jika berguna dalam bahasa Anda, Anda dapat menggunakan kata atau frasa yang mengidentifikasi sekelompok orang yang menjadi bagian dari atau berhubungan dengan Yesus. Terjemahan alternatif: “kaum-Nya sendiri” atau “bangsa milik-Nya”</w:t>
+      </w:r>
+    </w:p>
+    <w:p>
+      <w:pPr/>
+      <w:r>
+        <w:rPr>
+          <w:lang w:val="id_ID" w:bidi="id_ID"/>
+        </w:rPr>
+      </w:r>
+      <w:r>
+        <w:rPr>
+          <w:lang w:val="id_ID" w:bidi="id_ID"/>
+        </w:rPr>
+        <w:t xml:space="preserve">Lihat: </w:t>
+      </w:r>
+      <w:r>
+        <w:rPr>
+          <w:lang w:val="id_ID" w:bidi="id_ID"/>
+        </w:rPr>
+        <w:t>Hal-Hal yang Dianggap Sudah Diketahui dan Informasi yang Tersirat</w:t>
+      </w:r>
+      <w:r>
+        <w:rPr>
+          <w:lang w:val="id_ID" w:bidi="id_ID"/>
+        </w:rPr>
+      </w:r>
+      <w:r>
+        <w:rPr>
+          <w:lang w:val="id_ID" w:bidi="id_ID"/>
+        </w:rPr>
+      </w:r>
+    </w:p>
+    <w:p>
+      <w:pPr/>
+      <w:r>
+        <w:rPr>
+          <w:lang w:val="id_ID" w:bidi="id_ID"/>
+        </w:rPr>
+      </w:r>
+    </w:p>
+    <w:p>
+      <w:pPr>
+        <w:pStyle w:val="Heading2"/>
+      </w:pPr>
+      <w:r>
+        <w:rPr>
+          <w:lang w:val="id_ID" w:bidi="id_ID"/>
+        </w:rPr>
+        <w:t>Matius 1:22 (#1)</w:t>
+      </w:r>
+      <w:r>
+        <w:rPr>
+          <w:lang w:val="id_ID" w:bidi="id_ID"/>
+        </w:rPr>
+      </w:r>
+    </w:p>
+    <w:p>
+      <w:pPr/>
+      <w:r>
+        <w:rPr>
+          <w:lang w:val="id_ID" w:bidi="id_ID"/>
+        </w:rPr>
+      </w:r>
+      <w:r>
+        <w:rPr>
+          <w:b/>
+          <w:lang w:val="id_ID" w:bidi="id_ID"/>
+        </w:rPr>
+        <w:t>"Now"</w:t>
+      </w:r>
+    </w:p>
+    <w:p>
+      <w:pPr/>
+      <w:r>
+        <w:rPr>
+          <w:lang w:val="id_ID" w:bidi="id_ID"/>
+        </w:rPr>
+      </w:r>
+      <w:r>
+        <w:rPr>
+          <w:lang w:val="id_ID" w:bidi="id_ID"/>
+        </w:rPr>
+        <w:t xml:space="preserve">Ada versi bahasa Inggris yang mengawali ayat ini dengan kata "Now." Di sini, kata </w:t>
+      </w:r>
+      <w:r>
+        <w:rPr>
+          <w:b/>
+          <w:lang w:val="id_ID" w:bidi="id_ID"/>
+        </w:rPr>
+        <w:t>Now</w:t>
+      </w:r>
+      <w:r>
+        <w:rPr>
+          <w:lang w:val="id_ID" w:bidi="id_ID"/>
+        </w:rPr>
+        <w:t xml:space="preserve"> menunjukkan tanggapan Matius tentang apa yang telah dia ceritakan sejauh ini. Jika berguna dalam bahasa Anda, Anda dapat menggunakan kata atau frasa yang menunjukkan tanggapan dari narator, atau Anda dapat membiarkan kata </w:t>
+      </w:r>
+      <w:r>
+        <w:rPr>
+          <w:b/>
+          <w:lang w:val="id_ID" w:bidi="id_ID"/>
+        </w:rPr>
+        <w:t>Now</w:t>
+      </w:r>
+      <w:r>
+        <w:rPr>
+          <w:lang w:val="id_ID" w:bidi="id_ID"/>
+        </w:rPr>
+        <w:t xml:space="preserve"> tidak diterjemahkan. Terjemahan alternatif: “Catatan penulis” atau “Demikianlah,”</w:t>
+      </w:r>
+    </w:p>
+    <w:p>
+      <w:pPr/>
+      <w:r>
+        <w:rPr>
+          <w:lang w:val="id_ID" w:bidi="id_ID"/>
+        </w:rPr>
+      </w:r>
+      <w:r>
+        <w:rPr>
+          <w:lang w:val="id_ID" w:bidi="id_ID"/>
+        </w:rPr>
+        <w:t xml:space="preserve">Lihat: </w:t>
+      </w:r>
+      <w:r>
+        <w:rPr>
+          <w:lang w:val="id_ID" w:bidi="id_ID"/>
+        </w:rPr>
+        <w:t>Kata dan Frasa Penghubung</w:t>
+      </w:r>
+      <w:r>
+        <w:rPr>
+          <w:lang w:val="id_ID" w:bidi="id_ID"/>
+        </w:rPr>
+      </w:r>
+      <w:r>
+        <w:rPr>
+          <w:lang w:val="id_ID" w:bidi="id_ID"/>
+        </w:rPr>
+      </w:r>
+    </w:p>
+    <w:p>
+      <w:pPr/>
+      <w:r>
+        <w:rPr>
+          <w:lang w:val="id_ID" w:bidi="id_ID"/>
+        </w:rPr>
+      </w:r>
+    </w:p>
+    <w:p>
+      <w:pPr>
+        <w:pStyle w:val="Heading2"/>
+      </w:pPr>
+      <w:r>
+        <w:rPr>
+          <w:lang w:val="id_ID" w:bidi="id_ID"/>
+        </w:rPr>
+        <w:t>Matius 1:22 (#2)</w:t>
+      </w:r>
+      <w:r>
+        <w:rPr>
+          <w:lang w:val="id_ID" w:bidi="id_ID"/>
+        </w:rPr>
+      </w:r>
+    </w:p>
+    <w:p>
+      <w:pPr/>
+      <w:r>
+        <w:rPr>
+          <w:lang w:val="id_ID" w:bidi="id_ID"/>
+        </w:rPr>
+      </w:r>
+      <w:r>
+        <w:rPr>
+          <w:b/>
+          <w:lang w:val="id_ID" w:bidi="id_ID"/>
+        </w:rPr>
+        <w:t>"</w:t>
+      </w:r>
+      <w:r>
+        <w:rPr>
+          <w:b/>
+          <w:lang w:val="id_ID" w:bidi="id_ID"/>
+        </w:rPr>
+        <w:t>Hal itu terjadi</w:t>
+      </w:r>
+      <w:r>
+        <w:rPr>
+          <w:b/>
+          <w:lang w:val="id_ID" w:bidi="id_ID"/>
+        </w:rPr>
+        <w:t>"</w:t>
+      </w:r>
+    </w:p>
+    <w:p>
+      <w:pPr/>
+      <w:r>
+        <w:rPr>
+          <w:lang w:val="id_ID" w:bidi="id_ID"/>
+        </w:rPr>
+      </w:r>
+      <w:r>
+        <w:rPr>
+          <w:lang w:val="id_ID" w:bidi="id_ID"/>
+        </w:rPr>
+        <w:t xml:space="preserve">Kata ganti </w:t>
+      </w:r>
+      <w:r>
+        <w:rPr>
+          <w:b/>
+          <w:lang w:val="id_ID" w:bidi="id_ID"/>
+        </w:rPr>
+        <w:t>hal itu</w:t>
+      </w:r>
+      <w:r>
+        <w:rPr>
+          <w:lang w:val="id_ID" w:bidi="id_ID"/>
+        </w:rPr>
+        <w:t xml:space="preserve"> merujuk pada apa yang dikatakan kitab Matius tentang Maria yang hamil sebelum dia menikah dengan Yusuf (lihat </w:t>
+      </w:r>
+      <w:hyperlink r:id="rId27">
+        <w:r>
+          <w:rPr>
+            <w:lang w:val="id_ID" w:bidi="id_ID"/>
+          </w:rPr>
+          <w:rPr>
+            <w:color w:val="0000EE"/>
+            <w:u w:val="single"/>
+          </w:rPr>
+          <w:t>Mat. 1:18–21</w:t>
+        </w:r>
+      </w:hyperlink>
+      <w:r>
+        <w:rPr>
+          <w:lang w:val="id_ID" w:bidi="id_ID"/>
+        </w:rPr>
+        <w:t>). Jika hal ini tidak jelas bagi pembaca Anda, Anda dapat merujuk secara langsung pada peristiwa-peristiwa ini. Terjemahan alternatif: “Yesus lahir dengan cara seperti itu” atau “apa yang telah kukatakan kepadamu terjadi”</w:t>
+      </w:r>
+    </w:p>
+    <w:p>
+      <w:pPr/>
+      <w:r>
+        <w:rPr>
+          <w:lang w:val="id_ID" w:bidi="id_ID"/>
+        </w:rPr>
+      </w:r>
+      <w:r>
+        <w:rPr>
+          <w:lang w:val="id_ID" w:bidi="id_ID"/>
+        </w:rPr>
+        <w:t xml:space="preserve">Lihat: </w:t>
+      </w:r>
+      <w:r>
+        <w:rPr>
+          <w:lang w:val="id_ID" w:bidi="id_ID"/>
+        </w:rPr>
+        <w:t>Kata Ganti — Kapan Menggunakannya</w:t>
+      </w:r>
+      <w:r>
+        <w:rPr>
+          <w:lang w:val="id_ID" w:bidi="id_ID"/>
+        </w:rPr>
+      </w:r>
+      <w:r>
+        <w:rPr>
+          <w:lang w:val="id_ID" w:bidi="id_ID"/>
+        </w:rPr>
+      </w:r>
+    </w:p>
+    <w:p>
+      <w:pPr/>
+      <w:r>
+        <w:rPr>
+          <w:lang w:val="id_ID" w:bidi="id_ID"/>
+        </w:rPr>
+      </w:r>
+    </w:p>
+    <w:p>
+      <w:pPr>
+        <w:pStyle w:val="Heading2"/>
+      </w:pPr>
+      <w:r>
+        <w:rPr>
+          <w:lang w:val="id_ID" w:bidi="id_ID"/>
+        </w:rPr>
+        <w:t>Matius 1:22 (#3)</w:t>
+      </w:r>
+      <w:r>
+        <w:rPr>
+          <w:lang w:val="id_ID" w:bidi="id_ID"/>
+        </w:rPr>
+      </w:r>
+    </w:p>
+    <w:p>
+      <w:pPr/>
+      <w:r>
+        <w:rPr>
+          <w:lang w:val="id_ID" w:bidi="id_ID"/>
+        </w:rPr>
+      </w:r>
+      <w:r>
+        <w:rPr>
+          <w:b/>
+          <w:lang w:val="id_ID" w:bidi="id_ID"/>
+        </w:rPr>
+        <w:t>"</w:t>
+      </w:r>
+      <w:r>
+        <w:rPr>
+          <w:b/>
+          <w:lang w:val="id_ID" w:bidi="id_ID"/>
+        </w:rPr>
+        <w:t>supaya genaplah</w:t>
+      </w:r>
+      <w:r>
+        <w:rPr>
+          <w:b/>
+          <w:lang w:val="id_ID" w:bidi="id_ID"/>
+        </w:rPr>
+        <w:t>"</w:t>
+      </w:r>
+    </w:p>
+    <w:p>
+      <w:pPr/>
+      <w:r>
+        <w:rPr>
+          <w:lang w:val="id_ID" w:bidi="id_ID"/>
+        </w:rPr>
+      </w:r>
+      <w:r>
+        <w:rPr>
+          <w:lang w:val="id_ID" w:bidi="id_ID"/>
+        </w:rPr>
+        <w:t>Jika bahasa Anda tidak menggunakan bentuk pasif ini, Anda dapat mengungkapkan gagasan tersebut dalam bentuk aktif atau dengan cara lain yang alami dalam bahasa Anda. Terjemahan alternatif: “untuk menggenapi”</w:t>
+      </w:r>
+    </w:p>
+    <w:p>
+      <w:pPr/>
+      <w:r>
+        <w:rPr>
+          <w:lang w:val="id_ID" w:bidi="id_ID"/>
+        </w:rPr>
+      </w:r>
+      <w:r>
+        <w:rPr>
+          <w:lang w:val="id_ID" w:bidi="id_ID"/>
+        </w:rPr>
+        <w:t xml:space="preserve">Lihat: </w:t>
+      </w:r>
+      <w:r>
+        <w:rPr>
+          <w:lang w:val="id_ID" w:bidi="id_ID"/>
+        </w:rPr>
+        <w:t>Aktif atau Pasif</w:t>
+      </w:r>
+      <w:r>
+        <w:rPr>
+          <w:lang w:val="id_ID" w:bidi="id_ID"/>
+        </w:rPr>
+      </w:r>
+      <w:r>
+        <w:rPr>
+          <w:lang w:val="id_ID" w:bidi="id_ID"/>
+        </w:rPr>
+      </w:r>
+    </w:p>
+    <w:p>
+      <w:pPr/>
+      <w:r>
+        <w:rPr>
+          <w:lang w:val="id_ID" w:bidi="id_ID"/>
+        </w:rPr>
+      </w:r>
+    </w:p>
+    <w:p>
+      <w:pPr>
+        <w:pStyle w:val="Heading2"/>
+      </w:pPr>
+      <w:r>
+        <w:rPr>
+          <w:lang w:val="id_ID" w:bidi="id_ID"/>
+        </w:rPr>
+        <w:t>Matius 1:22 (#4)</w:t>
+      </w:r>
+      <w:r>
+        <w:rPr>
+          <w:lang w:val="id_ID" w:bidi="id_ID"/>
+        </w:rPr>
+      </w:r>
+    </w:p>
+    <w:p>
+      <w:pPr/>
+      <w:r>
+        <w:rPr>
+          <w:lang w:val="id_ID" w:bidi="id_ID"/>
+        </w:rPr>
+      </w:r>
+      <w:r>
+        <w:rPr>
+          <w:b/>
+          <w:lang w:val="id_ID" w:bidi="id_ID"/>
+        </w:rPr>
+        <w:t>"</w:t>
+      </w:r>
+      <w:r>
+        <w:rPr>
+          <w:b/>
+          <w:lang w:val="id_ID" w:bidi="id_ID"/>
+        </w:rPr>
+        <w:t>yang difirmankan Tuhan</w:t>
+      </w:r>
+      <w:r>
+        <w:rPr>
+          <w:b/>
+          <w:lang w:val="id_ID" w:bidi="id_ID"/>
+        </w:rPr>
+        <w:t>"</w:t>
+      </w:r>
+    </w:p>
+    <w:p>
+      <w:pPr/>
+      <w:r>
+        <w:rPr>
+          <w:lang w:val="id_ID" w:bidi="id_ID"/>
+        </w:rPr>
+      </w:r>
+      <w:r>
+        <w:rPr>
+          <w:lang w:val="id_ID" w:bidi="id_ID"/>
+        </w:rPr>
+        <w:t>Jika bahasa Anda tidak menggunakan bentuk pasif ini, Anda dapat mengungkapkan gagasan tersebut dalam bentuk aktif atau dengan cara lain yang lazim dalam bahasa Anda. Terjemahan alternatif: "yang Tuhan katakan"</w:t>
+      </w:r>
+    </w:p>
+    <w:p>
+      <w:pPr/>
+      <w:r>
+        <w:rPr>
+          <w:lang w:val="id_ID" w:bidi="id_ID"/>
+        </w:rPr>
+      </w:r>
+      <w:r>
+        <w:rPr>
+          <w:lang w:val="id_ID" w:bidi="id_ID"/>
+        </w:rPr>
+        <w:t xml:space="preserve">Lihat: </w:t>
+      </w:r>
+      <w:r>
+        <w:rPr>
+          <w:lang w:val="id_ID" w:bidi="id_ID"/>
+        </w:rPr>
+        <w:t>Aktif atau Pasif</w:t>
+      </w:r>
+      <w:r>
+        <w:rPr>
+          <w:lang w:val="id_ID" w:bidi="id_ID"/>
+        </w:rPr>
+      </w:r>
+      <w:r>
+        <w:rPr>
+          <w:lang w:val="id_ID" w:bidi="id_ID"/>
+        </w:rPr>
+      </w:r>
+    </w:p>
+    <w:p>
+      <w:pPr/>
+      <w:r>
+        <w:rPr>
+          <w:lang w:val="id_ID" w:bidi="id_ID"/>
+        </w:rPr>
+      </w:r>
+    </w:p>
+    <w:p>
+      <w:pPr>
+        <w:pStyle w:val="Heading2"/>
+      </w:pPr>
+      <w:r>
+        <w:rPr>
+          <w:lang w:val="id_ID" w:bidi="id_ID"/>
+        </w:rPr>
+        <w:t>Matius 1:22 (#5)</w:t>
+      </w:r>
+      <w:r>
+        <w:rPr>
+          <w:lang w:val="id_ID" w:bidi="id_ID"/>
+        </w:rPr>
+      </w:r>
+    </w:p>
+    <w:p>
+      <w:pPr/>
+      <w:r>
+        <w:rPr>
+          <w:lang w:val="id_ID" w:bidi="id_ID"/>
+        </w:rPr>
+      </w:r>
+      <w:r>
+        <w:rPr>
+          <w:b/>
+          <w:lang w:val="id_ID" w:bidi="id_ID"/>
+        </w:rPr>
+        <w:t>"nabi"</w:t>
+      </w:r>
+    </w:p>
+    <w:p>
+      <w:pPr/>
+      <w:r>
+        <w:rPr>
+          <w:lang w:val="id_ID" w:bidi="id_ID"/>
+        </w:rPr>
+      </w:r>
+      <w:r>
+        <w:rPr>
+          <w:b/>
+          <w:lang w:val="id_ID" w:bidi="id_ID"/>
+        </w:rPr>
+        <w:t xml:space="preserve">Nabi </w:t>
+      </w:r>
+      <w:r>
+        <w:rPr>
+          <w:lang w:val="id_ID" w:bidi="id_ID"/>
+        </w:rPr>
+        <w:t>yang dimaksud oleh kitab Matius adalah Yesaya. Jika berguna dalam bahasa Anda, Anda dapat membuat informasi ini lebih jelas. Terjemahan alternatif: “Nabi Yesaya”</w:t>
+      </w:r>
+    </w:p>
+    <w:p>
+      <w:pPr/>
+      <w:r>
+        <w:rPr>
+          <w:lang w:val="id_ID" w:bidi="id_ID"/>
+        </w:rPr>
+      </w:r>
+      <w:r>
+        <w:rPr>
+          <w:lang w:val="id_ID" w:bidi="id_ID"/>
+        </w:rPr>
+        <w:t xml:space="preserve">Lihat: </w:t>
+      </w:r>
+      <w:r>
+        <w:rPr>
+          <w:lang w:val="id_ID" w:bidi="id_ID"/>
+        </w:rPr>
+        <w:t>Hal-Hal yang Dianggap Sudah Diketahui dan Informasi yang Tersirat</w:t>
+      </w:r>
+      <w:r>
+        <w:rPr>
+          <w:lang w:val="id_ID" w:bidi="id_ID"/>
+        </w:rPr>
+      </w:r>
+      <w:r>
+        <w:rPr>
+          <w:lang w:val="id_ID" w:bidi="id_ID"/>
+        </w:rPr>
+      </w:r>
+    </w:p>
+    <w:p>
+      <w:pPr/>
+      <w:r>
+        <w:rPr>
+          <w:lang w:val="id_ID" w:bidi="id_ID"/>
+        </w:rPr>
+      </w:r>
+    </w:p>
+    <w:p>
+      <w:pPr>
+        <w:pStyle w:val="Heading2"/>
+      </w:pPr>
+      <w:r>
+        <w:rPr>
+          <w:lang w:val="id_ID" w:bidi="id_ID"/>
+        </w:rPr>
         <w:t>Matius 15:25 (#1)</w:t>
       </w:r>
       <w:r>
@@ -11702,7 +13482,7 @@
         </w:rPr>
         <w:t xml:space="preserve">Untuk meminta Yesus membantunya, Perempuan itu menawarkan sebuah cerita atau ilustrasi berdasarkan Perumpamaan yang Yesus ceritakan dalam </w:t>
       </w:r>
-      <w:hyperlink r:id="rId26">
+      <w:hyperlink r:id="rId28">
         <w:r>
           <w:rPr>
             <w:lang w:val="id_ID" w:bidi="id_ID"/>
@@ -11844,7 +13624,7 @@
         </w:rPr>
         <w:t xml:space="preserve">Lihat bagaimana Anda menerjemahkan frasa ini pada </w:t>
       </w:r>
-      <w:hyperlink r:id="rId26">
+      <w:hyperlink r:id="rId28">
         <w:r>
           <w:rPr>
             <w:lang w:val="id_ID" w:bidi="id_ID"/>
@@ -13109,7 +14889,7 @@
         </w:rPr>
         <w:t xml:space="preserve">Di sini, kata tersebut merujuk pada daerah di dekat kota Tirus dan Sidon (lihat </w:t>
       </w:r>
-      <w:hyperlink r:id="rId27">
+      <w:hyperlink r:id="rId29">
         <w:r>
           <w:rPr>
             <w:lang w:val="id_ID" w:bidi="id_ID"/>
@@ -14230,7 +16010,7 @@
         </w:rPr>
         <w:t xml:space="preserve">Lihat bagaimana Anda menerjemahkan frasa-frasa ini dalam </w:t>
       </w:r>
-      <w:hyperlink r:id="rId28">
+      <w:hyperlink r:id="rId30">
         <w:r>
           <w:rPr>
             <w:lang w:val="id_ID" w:bidi="id_ID"/>
@@ -15521,7 +17301,7 @@
         </w:rPr>
         <w:t xml:space="preserve"> dalam </w:t>
       </w:r>
-      <w:hyperlink r:id="rId29">
+      <w:hyperlink r:id="rId31">
         <w:r>
           <w:rPr>
             <w:lang w:val="id_ID" w:bidi="id_ID"/>
@@ -15929,7 +17709,7 @@
         </w:rPr>
         <w:t xml:space="preserve"> dalam </w:t>
       </w:r>
-      <w:hyperlink r:id="rId29">
+      <w:hyperlink r:id="rId31">
         <w:r>
           <w:rPr>
             <w:lang w:val="id_ID" w:bidi="id_ID"/>
@@ -18204,7 +19984,7 @@
         </w:rPr>
         <w:t xml:space="preserve">Lihat diskusi tentang masalah tekstual di akhir Catatan Umum untuk Pasal ini untuk memutuskan apakah akan menyertakan </w:t>
       </w:r>
-      <w:hyperlink r:id="rId30">
+      <w:hyperlink r:id="rId32">
         <w:r>
           <w:rPr>
             <w:lang w:val="id_ID" w:bidi="id_ID"/>
@@ -18931,7 +20711,7 @@
         </w:rPr>
         <w:t xml:space="preserve">Apa yang Yesus katakan di sini identik dengan apa yang Ia katakan dalam </w:t>
       </w:r>
-      <w:hyperlink r:id="rId31">
+      <w:hyperlink r:id="rId33">
         <w:r>
           <w:rPr>
             <w:lang w:val="id_ID" w:bidi="id_ID"/>
@@ -18962,7 +20742,7 @@
         </w:rPr>
         <w:t xml:space="preserve">. Terjemahkan kalimat ini seperti yang Anda lakukan dalam </w:t>
       </w:r>
-      <w:hyperlink r:id="rId31">
+      <w:hyperlink r:id="rId33">
         <w:r>
           <w:rPr>
             <w:lang w:val="id_ID" w:bidi="id_ID"/>
@@ -19056,7 +20836,7 @@
         </w:rPr>
         <w:t xml:space="preserve"> merujuk kepada orang-orang Farisi dan orang-orang Saduki yang telah meminta tanda (lihat </w:t>
       </w:r>
-      <w:hyperlink r:id="rId32">
+      <w:hyperlink r:id="rId34">
         <w:r>
           <w:rPr>
             <w:lang w:val="id_ID" w:bidi="id_ID"/>
@@ -20208,7 +21988,7 @@
         </w:rPr>
         <w:t xml:space="preserve"> sampai pada </w:t>
       </w:r>
-      <w:hyperlink r:id="rId33">
+      <w:hyperlink r:id="rId35">
         <w:r>
           <w:rPr>
             <w:lang w:val="id_ID" w:bidi="id_ID"/>
@@ -20226,7 +22006,7 @@
         </w:rPr>
         <w:t xml:space="preserve">. Jadi, Anda harus mempertahankan metafora ini di sini tanpa menjelaskan maknanya, karena Matius akan memberikan penjelasannya dalam </w:t>
       </w:r>
-      <w:hyperlink r:id="rId33">
+      <w:hyperlink r:id="rId35">
         <w:r>
           <w:rPr>
             <w:lang w:val="id_ID" w:bidi="id_ID"/>
@@ -21096,7 +22876,7 @@
         </w:rPr>
         <w:t>Di sini, seperti dalam</w:t>
       </w:r>
-      <w:hyperlink r:id="rId34">
+      <w:hyperlink r:id="rId36">
         <w:r>
           <w:rPr>
             <w:lang w:val="id_ID" w:bidi="id_ID"/>
@@ -21524,7 +23304,7 @@
         </w:rPr>
         <w:t xml:space="preserve"> dalam </w:t>
       </w:r>
-      <w:hyperlink r:id="rId29">
+      <w:hyperlink r:id="rId31">
         <w:r>
           <w:rPr>
             <w:lang w:val="id_ID" w:bidi="id_ID"/>
@@ -21734,7 +23514,7 @@
         </w:rPr>
         <w:t xml:space="preserve"> dalam Matius </w:t>
       </w:r>
-      <w:hyperlink r:id="rId35">
+      <w:hyperlink r:id="rId37">
         <w:r>
           <w:rPr>
             <w:lang w:val="id_ID" w:bidi="id_ID"/>
@@ -22123,7 +23903,7 @@
         </w:rPr>
         <w:t xml:space="preserve"> dalam </w:t>
       </w:r>
-      <w:hyperlink r:id="rId29">
+      <w:hyperlink r:id="rId31">
         <w:r>
           <w:rPr>
             <w:lang w:val="id_ID" w:bidi="id_ID"/>
@@ -22429,7 +24209,7 @@
         </w:rPr>
         <w:t xml:space="preserve"> dalam </w:t>
       </w:r>
-      <w:hyperlink r:id="rId36">
+      <w:hyperlink r:id="rId38">
         <w:r>
           <w:rPr>
             <w:lang w:val="id_ID" w:bidi="id_ID"/>
@@ -22748,7 +24528,7 @@
         </w:rPr>
         <w:t xml:space="preserve">Di sini, sama seperti dalam </w:t>
       </w:r>
-      <w:hyperlink r:id="rId37">
+      <w:hyperlink r:id="rId39">
         <w:r>
           <w:rPr>
             <w:lang w:val="id_ID" w:bidi="id_ID"/>
@@ -22875,7 +24655,7 @@
         </w:rPr>
         <w:t xml:space="preserve">Di sini, sama seperti dalam </w:t>
       </w:r>
-      <w:hyperlink r:id="rId37">
+      <w:hyperlink r:id="rId39">
         <w:r>
           <w:rPr>
             <w:lang w:val="id_ID" w:bidi="id_ID"/>
@@ -22919,7 +24699,7 @@
         </w:rPr>
         <w:t xml:space="preserve"> sampai pada </w:t>
       </w:r>
-      <w:hyperlink r:id="rId33">
+      <w:hyperlink r:id="rId35">
         <w:r>
           <w:rPr>
             <w:lang w:val="id_ID" w:bidi="id_ID"/>
@@ -22937,7 +24717,7 @@
         </w:rPr>
         <w:t xml:space="preserve">. Jadi, Anda harus mempertahankan metafora ini di sini tanpa menjelaskan maknanya, karena Matius akan memberikan penjelasannya dalam </w:t>
       </w:r>
-      <w:hyperlink r:id="rId33">
+      <w:hyperlink r:id="rId35">
         <w:r>
           <w:rPr>
             <w:lang w:val="id_ID" w:bidi="id_ID"/>
@@ -30369,7 +32149,7 @@
         </w:rPr>
         <w:t>, jika memungkinkan Anda harus mempertahankan metafora tersebut atau mengungkapkan ide tersebut dalam bentuk perumpamaan. Lihat bagaimana Anda menerjemahkan ungkapan serupa dalam</w:t>
       </w:r>
-      <w:hyperlink r:id="rId38">
+      <w:hyperlink r:id="rId40">
         <w:r>
           <w:rPr>
             <w:lang w:val="id_ID" w:bidi="id_ID"/>
@@ -30592,7 +32372,7 @@
         </w:rPr>
         <w:t xml:space="preserve"> kehidupan mereka saat ini akan kehilangan kehidupan kekal mereka, dan bahwa mereka yang telah kehilangan kehidupan mereka saat ini akan menemukan kehidupan kekal mereka. Jika akan lebih memudahkan pemahaman dalam bahasa Anda, Anda bisa membuat gagasan ini lebih eksplisit. Lihat bagaimana Anda menerjemahkan gagasan serupa dalam </w:t>
       </w:r>
-      <w:hyperlink r:id="rId39">
+      <w:hyperlink r:id="rId41">
         <w:r>
           <w:rPr>
             <w:lang w:val="id_ID" w:bidi="id_ID"/>
@@ -30719,7 +32499,7 @@
         </w:rPr>
         <w:t xml:space="preserve"> seseorang. Jika akan lebih memudahkan pemahaman dalam bahasa Anda, Anda bisa menggunakan ungkapan yang sebanding atau menyatakan maknanya secara jelas. Lihat bagaimana Anda menerjemahkan klausa serupa dalam </w:t>
       </w:r>
-      <w:hyperlink r:id="rId39">
+      <w:hyperlink r:id="rId41">
         <w:r>
           <w:rPr>
             <w:lang w:val="id_ID" w:bidi="id_ID"/>
@@ -30955,7 +32735,7 @@
         </w:rPr>
         <w:t xml:space="preserve">. Agar mudah dipahami dalam bahasa Anda, Anda bisa menggunakan ungkapan yang sebanding atau menyatakan maknanya dengan jelas. Lihat bagaimana Anda menerjemahkan klausa serupa dalam </w:t>
       </w:r>
-      <w:hyperlink r:id="rId39">
+      <w:hyperlink r:id="rId41">
         <w:r>
           <w:rPr>
             <w:lang w:val="id_ID" w:bidi="id_ID"/>
@@ -31165,7 +32945,7 @@
         </w:rPr>
         <w:t xml:space="preserve">memperkenalkan dasar lain untuk apa yang Yesus katakan dalam </w:t>
       </w:r>
-      <w:hyperlink r:id="rId40">
+      <w:hyperlink r:id="rId42">
         <w:r>
           <w:rPr>
             <w:lang w:val="id_ID" w:bidi="id_ID"/>
@@ -32061,7 +33841,7 @@
         </w:rPr>
         <w:t xml:space="preserve"> bisa memperkenalkan dasar untuk: (1) apa yang Yesus katakan dalam </w:t>
       </w:r>
-      <w:hyperlink r:id="rId41">
+      <w:hyperlink r:id="rId43">
         <w:r>
           <w:rPr>
             <w:lang w:val="id_ID" w:bidi="id_ID"/>
@@ -32079,7 +33859,7 @@
         </w:rPr>
         <w:t xml:space="preserve"> tentang bagaimana tidak ada yang lebih berharga daripada jiwa seseorang. Terjemahan alternatif: “kamu harus memikirkan jiwamu karena” (2) apa yang Yesus katakan dalam </w:t>
       </w:r>
-      <w:hyperlink r:id="rId42">
+      <w:hyperlink r:id="rId44">
         <w:r>
           <w:rPr>
             <w:lang w:val="id_ID" w:bidi="id_ID"/>

</xml_diff>

<commit_message>
Update Arb translation notes for 2026-08-11 release
</commit_message>
<xml_diff>
--- a/ind/docx/40.content.docx
+++ b/ind/docx/40.content.docx
@@ -40216,6 +40216,556 @@
           <w:lang w:val="id_ID" w:bidi="id_ID"/>
         </w:rPr>
         <w:t>Ungkapan</w:t>
+      </w:r>
+      <w:r>
+        <w:rPr>
+          <w:lang w:val="id_ID" w:bidi="id_ID"/>
+        </w:rPr>
+      </w:r>
+      <w:r>
+        <w:rPr>
+          <w:lang w:val="id_ID" w:bidi="id_ID"/>
+        </w:rPr>
+      </w:r>
+    </w:p>
+    <w:p>
+      <w:pPr/>
+      <w:r>
+        <w:rPr>
+          <w:lang w:val="id_ID" w:bidi="id_ID"/>
+        </w:rPr>
+      </w:r>
+    </w:p>
+    <w:p>
+      <w:pPr>
+        <w:pStyle w:val="Heading2"/>
+      </w:pPr>
+      <w:r>
+        <w:rPr>
+          <w:lang w:val="id_ID" w:bidi="id_ID"/>
+        </w:rPr>
+        <w:t>Matius 17:6 (#3)</w:t>
+      </w:r>
+      <w:r>
+        <w:rPr>
+          <w:lang w:val="id_ID" w:bidi="id_ID"/>
+        </w:rPr>
+      </w:r>
+    </w:p>
+    <w:p>
+      <w:pPr/>
+      <w:r>
+        <w:rPr>
+          <w:lang w:val="id_ID" w:bidi="id_ID"/>
+        </w:rPr>
+      </w:r>
+      <w:r>
+        <w:rPr>
+          <w:b/>
+          <w:lang w:val="id_ID" w:bidi="id_ID"/>
+        </w:rPr>
+        <w:t>"wajah mereka"</w:t>
+      </w:r>
+    </w:p>
+    <w:p>
+      <w:pPr/>
+      <w:r>
+        <w:rPr>
+          <w:lang w:val="id_ID" w:bidi="id_ID"/>
+        </w:rPr>
+      </w:r>
+      <w:r>
+        <w:rPr>
+          <w:lang w:val="id_ID" w:bidi="id_ID"/>
+        </w:rPr>
+        <w:t xml:space="preserve">Jika dalam bahasa Anda tidak alami untuk berbicara seolah-olah sekelompok orang hanya memiliki satu </w:t>
+      </w:r>
+      <w:r>
+        <w:rPr>
+          <w:b/>
+          <w:lang w:val="id_ID" w:bidi="id_ID"/>
+        </w:rPr>
+        <w:t>wajah</w:t>
+      </w:r>
+      <w:r>
+        <w:rPr>
+          <w:lang w:val="id_ID" w:bidi="id_ID"/>
+        </w:rPr>
+        <w:t>, Anda dapat menggunakan bentuk jamak dari kata tersebut dalam terjemahan Anda. Terjemahan alternatif: “wajah mereka”</w:t>
+      </w:r>
+    </w:p>
+    <w:p>
+      <w:pPr/>
+      <w:r>
+        <w:rPr>
+          <w:lang w:val="id_ID" w:bidi="id_ID"/>
+        </w:rPr>
+      </w:r>
+      <w:r>
+        <w:rPr>
+          <w:lang w:val="id_ID" w:bidi="id_ID"/>
+        </w:rPr>
+        <w:t xml:space="preserve">Lihat: </w:t>
+      </w:r>
+      <w:r>
+        <w:rPr>
+          <w:lang w:val="id_ID" w:bidi="id_ID"/>
+        </w:rPr>
+        <w:t>Kata Benda Kolektif</w:t>
+      </w:r>
+      <w:r>
+        <w:rPr>
+          <w:lang w:val="id_ID" w:bidi="id_ID"/>
+        </w:rPr>
+      </w:r>
+      <w:r>
+        <w:rPr>
+          <w:lang w:val="id_ID" w:bidi="id_ID"/>
+        </w:rPr>
+      </w:r>
+    </w:p>
+    <w:p>
+      <w:pPr/>
+      <w:r>
+        <w:rPr>
+          <w:lang w:val="id_ID" w:bidi="id_ID"/>
+        </w:rPr>
+      </w:r>
+    </w:p>
+    <w:p>
+      <w:pPr>
+        <w:pStyle w:val="Heading2"/>
+      </w:pPr>
+      <w:r>
+        <w:rPr>
+          <w:lang w:val="id_ID" w:bidi="id_ID"/>
+        </w:rPr>
+        <w:t>Matius 17:7 (#1)</w:t>
+      </w:r>
+      <w:r>
+        <w:rPr>
+          <w:lang w:val="id_ID" w:bidi="id_ID"/>
+        </w:rPr>
+      </w:r>
+    </w:p>
+    <w:p>
+      <w:pPr/>
+      <w:r>
+        <w:rPr>
+          <w:lang w:val="id_ID" w:bidi="id_ID"/>
+        </w:rPr>
+      </w:r>
+      <w:r>
+        <w:rPr>
+          <w:b/>
+          <w:lang w:val="id_ID" w:bidi="id_ID"/>
+        </w:rPr>
+        <w:t>"berkata, “Berdirilah, jangan takut!"</w:t>
+      </w:r>
+    </w:p>
+    <w:p>
+      <w:pPr/>
+      <w:r>
+        <w:rPr>
+          <w:lang w:val="id_ID" w:bidi="id_ID"/>
+        </w:rPr>
+      </w:r>
+      <w:r>
+        <w:rPr>
+          <w:lang w:val="id_ID" w:bidi="id_ID"/>
+        </w:rPr>
+        <w:t>Mungkin lebih alami dalam bahasa Anda untuk menggunakan kutipan tidak langsung di sini. Terjemahan alternatif: "mengatakan bahwa mereka harus berdiri dan tidak takut"</w:t>
+      </w:r>
+    </w:p>
+    <w:p>
+      <w:pPr/>
+      <w:r>
+        <w:rPr>
+          <w:lang w:val="id_ID" w:bidi="id_ID"/>
+        </w:rPr>
+      </w:r>
+      <w:r>
+        <w:rPr>
+          <w:lang w:val="id_ID" w:bidi="id_ID"/>
+        </w:rPr>
+        <w:t xml:space="preserve">Lihat: </w:t>
+      </w:r>
+      <w:r>
+        <w:rPr>
+          <w:lang w:val="id_ID" w:bidi="id_ID"/>
+        </w:rPr>
+        <w:t>Kutipan Langsung dan Tidak Langsung</w:t>
+      </w:r>
+      <w:r>
+        <w:rPr>
+          <w:lang w:val="id_ID" w:bidi="id_ID"/>
+        </w:rPr>
+      </w:r>
+      <w:r>
+        <w:rPr>
+          <w:lang w:val="id_ID" w:bidi="id_ID"/>
+        </w:rPr>
+      </w:r>
+    </w:p>
+    <w:p>
+      <w:pPr/>
+      <w:r>
+        <w:rPr>
+          <w:lang w:val="id_ID" w:bidi="id_ID"/>
+        </w:rPr>
+      </w:r>
+    </w:p>
+    <w:p>
+      <w:pPr>
+        <w:pStyle w:val="Heading2"/>
+      </w:pPr>
+      <w:r>
+        <w:rPr>
+          <w:lang w:val="id_ID" w:bidi="id_ID"/>
+        </w:rPr>
+        <w:t>Matius 17:7 (#2)</w:t>
+      </w:r>
+      <w:r>
+        <w:rPr>
+          <w:lang w:val="id_ID" w:bidi="id_ID"/>
+        </w:rPr>
+      </w:r>
+    </w:p>
+    <w:p>
+      <w:pPr/>
+      <w:r>
+        <w:rPr>
+          <w:lang w:val="id_ID" w:bidi="id_ID"/>
+        </w:rPr>
+      </w:r>
+      <w:r>
+        <w:rPr>
+          <w:b/>
+          <w:lang w:val="id_ID" w:bidi="id_ID"/>
+        </w:rPr>
+        <w:t>"Berdirilah, jangan takut"</w:t>
+      </w:r>
+    </w:p>
+    <w:p>
+      <w:pPr/>
+      <w:r>
+        <w:rPr>
+          <w:lang w:val="id_ID" w:bidi="id_ID"/>
+        </w:rPr>
+      </w:r>
+      <w:r>
+        <w:rPr>
+          <w:lang w:val="id_ID" w:bidi="id_ID"/>
+        </w:rPr>
+        <w:t>Jika lebih alami dalam bahasa Anda, Anda bisa membalik urutan dua perintah ini. Terjemahan alternatif: “Jangan takut; berdirilah”</w:t>
+      </w:r>
+    </w:p>
+    <w:p>
+      <w:pPr/>
+      <w:r>
+        <w:rPr>
+          <w:lang w:val="id_ID" w:bidi="id_ID"/>
+        </w:rPr>
+      </w:r>
+      <w:r>
+        <w:rPr>
+          <w:lang w:val="id_ID" w:bidi="id_ID"/>
+        </w:rPr>
+        <w:t xml:space="preserve">Lihat: </w:t>
+      </w:r>
+      <w:r>
+        <w:rPr>
+          <w:lang w:val="id_ID" w:bidi="id_ID"/>
+        </w:rPr>
+        <w:t>Struktur Informasi</w:t>
+      </w:r>
+      <w:r>
+        <w:rPr>
+          <w:lang w:val="id_ID" w:bidi="id_ID"/>
+        </w:rPr>
+      </w:r>
+      <w:r>
+        <w:rPr>
+          <w:lang w:val="id_ID" w:bidi="id_ID"/>
+        </w:rPr>
+      </w:r>
+    </w:p>
+    <w:p>
+      <w:pPr/>
+      <w:r>
+        <w:rPr>
+          <w:lang w:val="id_ID" w:bidi="id_ID"/>
+        </w:rPr>
+      </w:r>
+    </w:p>
+    <w:p>
+      <w:pPr>
+        <w:pStyle w:val="Heading2"/>
+      </w:pPr>
+      <w:r>
+        <w:rPr>
+          <w:lang w:val="id_ID" w:bidi="id_ID"/>
+        </w:rPr>
+        <w:t>Matius 17:8 (#1)</w:t>
+      </w:r>
+      <w:r>
+        <w:rPr>
+          <w:lang w:val="id_ID" w:bidi="id_ID"/>
+        </w:rPr>
+      </w:r>
+    </w:p>
+    <w:p>
+      <w:pPr/>
+      <w:r>
+        <w:rPr>
+          <w:lang w:val="id_ID" w:bidi="id_ID"/>
+        </w:rPr>
+      </w:r>
+      <w:r>
+        <w:rPr>
+          <w:b/>
+          <w:lang w:val="id_ID" w:bidi="id_ID"/>
+        </w:rPr>
+        <w:t>"Dan"</w:t>
+      </w:r>
+    </w:p>
+    <w:p>
+      <w:pPr/>
+      <w:r>
+        <w:rPr>
+          <w:lang w:val="id_ID" w:bidi="id_ID"/>
+        </w:rPr>
+      </w:r>
+      <w:r>
+        <w:rPr>
+          <w:lang w:val="id_ID" w:bidi="id_ID"/>
+        </w:rPr>
+        <w:t xml:space="preserve">Di sini, kata </w:t>
+      </w:r>
+      <w:r>
+        <w:rPr>
+          <w:b/>
+          <w:lang w:val="id_ID" w:bidi="id_ID"/>
+        </w:rPr>
+        <w:t>Dan</w:t>
+      </w:r>
+      <w:r>
+        <w:rPr>
+          <w:lang w:val="id_ID" w:bidi="id_ID"/>
+        </w:rPr>
+        <w:t xml:space="preserve"> memperkenalkan hal berikutnya yang terjadi. Jika akan lebih memudahkan pemahaman dalam bahasa Anda, Anda bisa menggunakan kata atau frasa yang memperkenalkan peristiwa berikutnya, atau Anda bisa membiarkan kata </w:t>
+      </w:r>
+      <w:r>
+        <w:rPr>
+          <w:b/>
+          <w:lang w:val="id_ID" w:bidi="id_ID"/>
+        </w:rPr>
+        <w:t>Dan</w:t>
+      </w:r>
+      <w:r>
+        <w:rPr>
+          <w:lang w:val="id_ID" w:bidi="id_ID"/>
+        </w:rPr>
+        <w:t xml:space="preserve"> tidak diterjemahkan. Terjemahan alternatif: “Kemudian”</w:t>
+      </w:r>
+    </w:p>
+    <w:p>
+      <w:pPr/>
+      <w:r>
+        <w:rPr>
+          <w:lang w:val="id_ID" w:bidi="id_ID"/>
+        </w:rPr>
+      </w:r>
+      <w:r>
+        <w:rPr>
+          <w:lang w:val="id_ID" w:bidi="id_ID"/>
+        </w:rPr>
+        <w:t xml:space="preserve">Lihat: </w:t>
+      </w:r>
+      <w:r>
+        <w:rPr>
+          <w:lang w:val="id_ID" w:bidi="id_ID"/>
+        </w:rPr>
+        <w:t>Menghubungkan Kata dan Frasa</w:t>
+      </w:r>
+      <w:r>
+        <w:rPr>
+          <w:lang w:val="id_ID" w:bidi="id_ID"/>
+        </w:rPr>
+      </w:r>
+      <w:r>
+        <w:rPr>
+          <w:lang w:val="id_ID" w:bidi="id_ID"/>
+        </w:rPr>
+      </w:r>
+    </w:p>
+    <w:p>
+      <w:pPr/>
+      <w:r>
+        <w:rPr>
+          <w:lang w:val="id_ID" w:bidi="id_ID"/>
+        </w:rPr>
+      </w:r>
+    </w:p>
+    <w:p>
+      <w:pPr>
+        <w:pStyle w:val="Heading2"/>
+      </w:pPr>
+      <w:r>
+        <w:rPr>
+          <w:lang w:val="id_ID" w:bidi="id_ID"/>
+        </w:rPr>
+        <w:t>Matius 17:8 (#2)</w:t>
+      </w:r>
+      <w:r>
+        <w:rPr>
+          <w:lang w:val="id_ID" w:bidi="id_ID"/>
+        </w:rPr>
+      </w:r>
+    </w:p>
+    <w:p>
+      <w:pPr/>
+      <w:r>
+        <w:rPr>
+          <w:lang w:val="id_ID" w:bidi="id_ID"/>
+        </w:rPr>
+      </w:r>
+      <w:r>
+        <w:rPr>
+          <w:b/>
+          <w:lang w:val="id_ID" w:bidi="id_ID"/>
+        </w:rPr>
+        <w:t>"ketika mereka mengangkat kepala"</w:t>
+      </w:r>
+    </w:p>
+    <w:p>
+      <w:pPr/>
+      <w:r>
+        <w:rPr>
+          <w:lang w:val="id_ID" w:bidi="id_ID"/>
+        </w:rPr>
+      </w:r>
+      <w:r>
+        <w:rPr>
+          <w:lang w:val="id_ID" w:bidi="id_ID"/>
+        </w:rPr>
+        <w:t xml:space="preserve">Di sini, frasa </w:t>
+      </w:r>
+      <w:r>
+        <w:rPr>
+          <w:b/>
+          <w:lang w:val="id_ID" w:bidi="id_ID"/>
+        </w:rPr>
+        <w:t>mereka mengangkat kepala</w:t>
+      </w:r>
+      <w:r>
+        <w:rPr>
+          <w:lang w:val="id_ID" w:bidi="id_ID"/>
+        </w:rPr>
+        <w:t xml:space="preserve"> berarti mereka berhenti melihat ke tanah dan melihat ke atas pada apa yang terjadi di sekitar mereka. Jika akan lebih memudahkan pemahaman dalam bahasa Anda, Anda bisa menggunakan frasa yang sebanding atau menyatakan maknanya secara jelas. Terjemahan alternatif: “setelah melihat ke atas dari tanah” atau “setelah melihat sekeliling”</w:t>
+      </w:r>
+    </w:p>
+    <w:p>
+      <w:pPr/>
+      <w:r>
+        <w:rPr>
+          <w:lang w:val="id_ID" w:bidi="id_ID"/>
+        </w:rPr>
+      </w:r>
+      <w:r>
+        <w:rPr>
+          <w:lang w:val="id_ID" w:bidi="id_ID"/>
+        </w:rPr>
+        <w:t xml:space="preserve">Lihat: </w:t>
+      </w:r>
+      <w:r>
+        <w:rPr>
+          <w:lang w:val="id_ID" w:bidi="id_ID"/>
+        </w:rPr>
+        <w:t>Ungkapan</w:t>
+      </w:r>
+      <w:r>
+        <w:rPr>
+          <w:lang w:val="id_ID" w:bidi="id_ID"/>
+        </w:rPr>
+      </w:r>
+      <w:r>
+        <w:rPr>
+          <w:lang w:val="id_ID" w:bidi="id_ID"/>
+        </w:rPr>
+      </w:r>
+    </w:p>
+    <w:p>
+      <w:pPr/>
+      <w:r>
+        <w:rPr>
+          <w:lang w:val="id_ID" w:bidi="id_ID"/>
+        </w:rPr>
+      </w:r>
+    </w:p>
+    <w:p>
+      <w:pPr>
+        <w:pStyle w:val="Heading2"/>
+      </w:pPr>
+      <w:r>
+        <w:rPr>
+          <w:lang w:val="id_ID" w:bidi="id_ID"/>
+        </w:rPr>
+        <w:t>Matius 17:8 (#3)</w:t>
+      </w:r>
+      <w:r>
+        <w:rPr>
+          <w:lang w:val="id_ID" w:bidi="id_ID"/>
+        </w:rPr>
+      </w:r>
+    </w:p>
+    <w:p>
+      <w:pPr/>
+      <w:r>
+        <w:rPr>
+          <w:lang w:val="id_ID" w:bidi="id_ID"/>
+        </w:rPr>
+      </w:r>
+      <w:r>
+        <w:rPr>
+          <w:b/>
+          <w:lang w:val="id_ID" w:bidi="id_ID"/>
+        </w:rPr>
+        <w:t>"mereka tidak melihat seorang pun kecuali Yesus seorang diri."</w:t>
+      </w:r>
+    </w:p>
+    <w:p>
+      <w:pPr/>
+      <w:r>
+        <w:rPr>
+          <w:lang w:val="id_ID" w:bidi="id_ID"/>
+        </w:rPr>
+      </w:r>
+      <w:r>
+        <w:rPr>
+          <w:lang w:val="id_ID" w:bidi="id_ID"/>
+        </w:rPr>
+        <w:t>Jika dalam bahasa Anda tampak bahwa Matius membuat pernyataan di sini dan kemudian bertentangan dengan itu, Anda dapat mengubah kata-kata ini untuk menghindari penggunaan klausa pengecualian. Terjemahan alternatif: “mereka hanya melihat Yesus sendiri”</w:t>
+      </w:r>
+    </w:p>
+    <w:p>
+      <w:pPr/>
+      <w:r>
+        <w:rPr>
+          <w:lang w:val="id_ID" w:bidi="id_ID"/>
+        </w:rPr>
+      </w:r>
+      <w:r>
+        <w:rPr>
+          <w:lang w:val="id_ID" w:bidi="id_ID"/>
+        </w:rPr>
+        <w:t xml:space="preserve">Lihat: </w:t>
+      </w:r>
+      <w:r>
+        <w:rPr>
+          <w:lang w:val="id_ID" w:bidi="id_ID"/>
+        </w:rPr>
+        <w:t>Hubungkan — Klausul Pengecualian</w:t>
       </w:r>
       <w:r>
         <w:rPr>

</xml_diff>